<commit_message>
Ship invoice terms/currency, draft invoice delete, and related estimate/service UI corrections so the live site matches the latest client guide.
Co-authored-by: Cursor <cursoragent@cursor.com>
</commit_message>
<xml_diff>
--- a/docs/MEMS_SITE_CORRECTIONS_CLIENT_GUIDE.docx
+++ b/docs/MEMS_SITE_CORRECTIONS_CLIENT_GUIDE.docx
@@ -245,7 +245,7 @@
                 <w:szCs w:val="18"/>
                 <w:rFonts w:ascii="Calibri" w:cs="Calibri" w:eastAsia="Calibri" w:hAnsi="Calibri"/>
               </w:rPr>
-              <w:t xml:space="preserve">Client information pack — 18 corrections completed</w:t>
+              <w:t xml:space="preserve">Client information pack — 20 corrections completed</w:t>
             </w:r>
           </w:p>
         </w:tc>
@@ -315,7 +315,7 @@
                 <w:szCs w:val="18"/>
                 <w:rFonts w:ascii="Calibri" w:cs="Calibri" w:eastAsia="Calibri" w:hAnsi="Calibri"/>
               </w:rPr>
-              <w:t xml:space="preserve">27 October 2026</w:t>
+              <w:t xml:space="preserve">30 October 2026</w:t>
             </w:r>
           </w:p>
         </w:tc>
@@ -536,7 +536,7 @@
           <w:szCs w:val="20"/>
           <w:rFonts w:ascii="Calibri" w:cs="Calibri" w:eastAsia="Calibri" w:hAnsi="Calibri"/>
         </w:rPr>
-        <w:t xml:space="preserve">This guide informs the client that the Medical Equipment Service Management site has been updated with eighteen corrections. Each item below explains what was added or changed, which page or menu location to open, and how to use the new behaviour.</w:t>
+        <w:t xml:space="preserve">This guide informs the client that the Medical Equipment Service Management site has been updated with twenty corrections. Each item below explains what was added or changed, which page or menu location to open, and how to use the new behaviour.</w:t>
       </w:r>
     </w:p>
     <w:p>
@@ -835,6 +835,68 @@
           <w:rFonts w:ascii="Calibri" w:cs="Calibri" w:eastAsia="Calibri" w:hAnsi="Calibri"/>
         </w:rPr>
         <w:t xml:space="preserve">Signature draw or upload for inspection, estimate, and billing</w:t>
+      </w:r>
+    </w:p>
+    <w:p>
+      <w:pPr>
+        <w:spacing w:after="80"/>
+      </w:pPr>
+      <w:r>
+        <w:rPr>
+          <w:b/>
+          <w:bCs/>
+          <w:i w:val="false"/>
+          <w:iCs w:val="false"/>
+          <w:color w:val="1B4F9C"/>
+          <w:sz w:val="18"/>
+          <w:szCs w:val="18"/>
+          <w:rFonts w:ascii="Calibri" w:cs="Calibri" w:eastAsia="Calibri" w:hAnsi="Calibri"/>
+        </w:rPr>
+        <w:t xml:space="preserve">•  </w:t>
+      </w:r>
+      <w:r>
+        <w:rPr>
+          <w:b w:val="false"/>
+          <w:bCs w:val="false"/>
+          <w:i w:val="false"/>
+          <w:iCs w:val="false"/>
+          <w:color w:val="0F2A44"/>
+          <w:sz w:val="18"/>
+          <w:szCs w:val="18"/>
+          <w:rFonts w:ascii="Calibri" w:cs="Calibri" w:eastAsia="Calibri" w:hAnsi="Calibri"/>
+        </w:rPr>
+        <w:t xml:space="preserve">Approval bypass removed from Users form (use Settings skip-approvals instead)</w:t>
+      </w:r>
+    </w:p>
+    <w:p>
+      <w:pPr>
+        <w:spacing w:after="80"/>
+      </w:pPr>
+      <w:r>
+        <w:rPr>
+          <w:b/>
+          <w:bCs/>
+          <w:i w:val="false"/>
+          <w:iCs w:val="false"/>
+          <w:color w:val="1B4F9C"/>
+          <w:sz w:val="18"/>
+          <w:szCs w:val="18"/>
+          <w:rFonts w:ascii="Calibri" w:cs="Calibri" w:eastAsia="Calibri" w:hAnsi="Calibri"/>
+        </w:rPr>
+        <w:t xml:space="preserve">•  </w:t>
+      </w:r>
+      <w:r>
+        <w:rPr>
+          <w:b w:val="false"/>
+          <w:bCs w:val="false"/>
+          <w:i w:val="false"/>
+          <w:iCs w:val="false"/>
+          <w:color w:val="0F2A44"/>
+          <w:sz w:val="18"/>
+          <w:szCs w:val="18"/>
+          <w:rFonts w:ascii="Calibri" w:cs="Calibri" w:eastAsia="Calibri" w:hAnsi="Calibri"/>
+        </w:rPr>
+        <w:t xml:space="preserve">Final service report PDF without redundant Service section fields</w:t>
       </w:r>
     </w:p>
     <w:p>
@@ -3536,6 +3598,282 @@
           </w:p>
         </w:tc>
       </w:tr>
+      <w:tr>
+        <w:tc>
+          <w:tcPr>
+            <w:tcW w:type="dxa" w:w="700"/>
+            <w:tcBorders>
+              <w:top w:val="single" w:color="D0D8E0" w:sz="4"/>
+              <w:left w:val="single" w:color="D0D8E0" w:sz="4"/>
+              <w:bottom w:val="single" w:color="D0D8E0" w:sz="4"/>
+              <w:right w:val="single" w:color="D0D8E0" w:sz="4"/>
+            </w:tcBorders>
+            <w:shd w:fill="E8F1FB" w:val="clear"/>
+            <w:tcMar>
+              <w:top w:type="dxa" w:w="80"/>
+              <w:left w:type="dxa" w:w="120"/>
+              <w:bottom w:type="dxa" w:w="80"/>
+              <w:right w:type="dxa" w:w="120"/>
+            </w:tcMar>
+          </w:tcPr>
+          <w:p>
+            <w:pPr>
+              <w:jc w:val="center"/>
+            </w:pPr>
+            <w:r>
+              <w:rPr>
+                <w:b/>
+                <w:bCs/>
+                <w:color w:val="0F3A75"/>
+                <w:sz w:val="17"/>
+                <w:szCs w:val="17"/>
+                <w:rFonts w:ascii="Calibri" w:cs="Calibri" w:eastAsia="Calibri" w:hAnsi="Calibri"/>
+              </w:rPr>
+              <w:t xml:space="preserve">19</w:t>
+            </w:r>
+          </w:p>
+        </w:tc>
+        <w:tc>
+          <w:tcPr>
+            <w:tcW w:type="dxa" w:w="5200"/>
+            <w:tcBorders>
+              <w:top w:val="single" w:color="D0D8E0" w:sz="4"/>
+              <w:left w:val="single" w:color="D0D8E0" w:sz="4"/>
+              <w:bottom w:val="single" w:color="D0D8E0" w:sz="4"/>
+              <w:right w:val="single" w:color="D0D8E0" w:sz="4"/>
+            </w:tcBorders>
+            <w:shd w:fill="FFFFFF" w:val="clear"/>
+            <w:tcMar>
+              <w:top w:type="dxa" w:w="80"/>
+              <w:left w:type="dxa" w:w="120"/>
+              <w:bottom w:type="dxa" w:w="80"/>
+              <w:right w:type="dxa" w:w="120"/>
+            </w:tcMar>
+          </w:tcPr>
+          <w:p>
+            <w:pPr>
+              <w:jc w:val="left"/>
+            </w:pPr>
+            <w:r>
+              <w:rPr>
+                <w:b w:val="false"/>
+                <w:bCs w:val="false"/>
+                <w:color w:val="0F2A44"/>
+                <w:sz w:val="17"/>
+                <w:szCs w:val="17"/>
+                <w:rFonts w:ascii="Calibri" w:cs="Calibri" w:eastAsia="Calibri" w:hAnsi="Calibri"/>
+              </w:rPr>
+              <w:t xml:space="preserve">Remove approval control from Users</w:t>
+            </w:r>
+          </w:p>
+        </w:tc>
+        <w:tc>
+          <w:tcPr>
+            <w:tcW w:type="dxa" w:w="2460"/>
+            <w:tcBorders>
+              <w:top w:val="single" w:color="D0D8E0" w:sz="4"/>
+              <w:left w:val="single" w:color="D0D8E0" w:sz="4"/>
+              <w:bottom w:val="single" w:color="D0D8E0" w:sz="4"/>
+              <w:right w:val="single" w:color="D0D8E0" w:sz="4"/>
+            </w:tcBorders>
+            <w:shd w:fill="FFFFFF" w:val="clear"/>
+            <w:tcMar>
+              <w:top w:type="dxa" w:w="80"/>
+              <w:left w:type="dxa" w:w="120"/>
+              <w:bottom w:type="dxa" w:w="80"/>
+              <w:right w:type="dxa" w:w="120"/>
+            </w:tcMar>
+          </w:tcPr>
+          <w:p>
+            <w:pPr>
+              <w:jc w:val="left"/>
+            </w:pPr>
+            <w:r>
+              <w:rPr>
+                <w:b w:val="false"/>
+                <w:bCs w:val="false"/>
+                <w:color w:val="5A6A7A"/>
+                <w:sz w:val="16"/>
+                <w:szCs w:val="16"/>
+                <w:rFonts w:ascii="Calibri" w:cs="Calibri" w:eastAsia="Calibri" w:hAnsi="Calibri"/>
+              </w:rPr>
+              <w:t xml:space="preserve">Users · Administration</w:t>
+            </w:r>
+          </w:p>
+        </w:tc>
+        <w:tc>
+          <w:tcPr>
+            <w:tcW w:type="dxa" w:w="1000"/>
+            <w:tcBorders>
+              <w:top w:val="single" w:color="D0D8E0" w:sz="4"/>
+              <w:left w:val="single" w:color="D0D8E0" w:sz="4"/>
+              <w:bottom w:val="single" w:color="D0D8E0" w:sz="4"/>
+              <w:right w:val="single" w:color="D0D8E0" w:sz="4"/>
+            </w:tcBorders>
+            <w:shd w:fill="E6F4EA" w:val="clear"/>
+            <w:tcMar>
+              <w:top w:type="dxa" w:w="80"/>
+              <w:left w:type="dxa" w:w="120"/>
+              <w:bottom w:type="dxa" w:w="80"/>
+              <w:right w:type="dxa" w:w="120"/>
+            </w:tcMar>
+          </w:tcPr>
+          <w:p>
+            <w:pPr>
+              <w:jc w:val="center"/>
+            </w:pPr>
+            <w:r>
+              <w:rPr>
+                <w:b/>
+                <w:bCs/>
+                <w:color w:val="1F6B3A"/>
+                <w:sz w:val="16"/>
+                <w:szCs w:val="16"/>
+                <w:rFonts w:ascii="Calibri" w:cs="Calibri" w:eastAsia="Calibri" w:hAnsi="Calibri"/>
+              </w:rPr>
+              <w:t xml:space="preserve">Done</w:t>
+            </w:r>
+          </w:p>
+        </w:tc>
+      </w:tr>
+      <w:tr>
+        <w:tc>
+          <w:tcPr>
+            <w:tcW w:type="dxa" w:w="700"/>
+            <w:tcBorders>
+              <w:top w:val="single" w:color="D0D8E0" w:sz="4"/>
+              <w:left w:val="single" w:color="D0D8E0" w:sz="4"/>
+              <w:bottom w:val="single" w:color="D0D8E0" w:sz="4"/>
+              <w:right w:val="single" w:color="D0D8E0" w:sz="4"/>
+            </w:tcBorders>
+            <w:shd w:fill="E8F1FB" w:val="clear"/>
+            <w:tcMar>
+              <w:top w:type="dxa" w:w="80"/>
+              <w:left w:type="dxa" w:w="120"/>
+              <w:bottom w:type="dxa" w:w="80"/>
+              <w:right w:type="dxa" w:w="120"/>
+            </w:tcMar>
+          </w:tcPr>
+          <w:p>
+            <w:pPr>
+              <w:jc w:val="center"/>
+            </w:pPr>
+            <w:r>
+              <w:rPr>
+                <w:b/>
+                <w:bCs/>
+                <w:color w:val="0F3A75"/>
+                <w:sz w:val="17"/>
+                <w:szCs w:val="17"/>
+                <w:rFonts w:ascii="Calibri" w:cs="Calibri" w:eastAsia="Calibri" w:hAnsi="Calibri"/>
+              </w:rPr>
+              <w:t xml:space="preserve">20</w:t>
+            </w:r>
+          </w:p>
+        </w:tc>
+        <w:tc>
+          <w:tcPr>
+            <w:tcW w:type="dxa" w:w="5200"/>
+            <w:tcBorders>
+              <w:top w:val="single" w:color="D0D8E0" w:sz="4"/>
+              <w:left w:val="single" w:color="D0D8E0" w:sz="4"/>
+              <w:bottom w:val="single" w:color="D0D8E0" w:sz="4"/>
+              <w:right w:val="single" w:color="D0D8E0" w:sz="4"/>
+            </w:tcBorders>
+            <w:shd w:fill="FFFFFF" w:val="clear"/>
+            <w:tcMar>
+              <w:top w:type="dxa" w:w="80"/>
+              <w:left w:type="dxa" w:w="120"/>
+              <w:bottom w:type="dxa" w:w="80"/>
+              <w:right w:type="dxa" w:w="120"/>
+            </w:tcMar>
+          </w:tcPr>
+          <w:p>
+            <w:pPr>
+              <w:jc w:val="left"/>
+            </w:pPr>
+            <w:r>
+              <w:rPr>
+                <w:b w:val="false"/>
+                <w:bCs w:val="false"/>
+                <w:color w:val="0F2A44"/>
+                <w:sz w:val="17"/>
+                <w:szCs w:val="17"/>
+                <w:rFonts w:ascii="Calibri" w:cs="Calibri" w:eastAsia="Calibri" w:hAnsi="Calibri"/>
+              </w:rPr>
+              <w:t xml:space="preserve">Final service report — remove Service section</w:t>
+            </w:r>
+          </w:p>
+        </w:tc>
+        <w:tc>
+          <w:tcPr>
+            <w:tcW w:type="dxa" w:w="2460"/>
+            <w:tcBorders>
+              <w:top w:val="single" w:color="D0D8E0" w:sz="4"/>
+              <w:left w:val="single" w:color="D0D8E0" w:sz="4"/>
+              <w:bottom w:val="single" w:color="D0D8E0" w:sz="4"/>
+              <w:right w:val="single" w:color="D0D8E0" w:sz="4"/>
+            </w:tcBorders>
+            <w:shd w:fill="FFFFFF" w:val="clear"/>
+            <w:tcMar>
+              <w:top w:type="dxa" w:w="80"/>
+              <w:left w:type="dxa" w:w="120"/>
+              <w:bottom w:type="dxa" w:w="80"/>
+              <w:right w:type="dxa" w:w="120"/>
+            </w:tcMar>
+          </w:tcPr>
+          <w:p>
+            <w:pPr>
+              <w:jc w:val="left"/>
+            </w:pPr>
+            <w:r>
+              <w:rPr>
+                <w:b w:val="false"/>
+                <w:bCs w:val="false"/>
+                <w:color w:val="5A6A7A"/>
+                <w:sz w:val="16"/>
+                <w:szCs w:val="16"/>
+                <w:rFonts w:ascii="Calibri" w:cs="Calibri" w:eastAsia="Calibri" w:hAnsi="Calibri"/>
+              </w:rPr>
+              <w:t xml:space="preserve">Reports / PDFs</w:t>
+            </w:r>
+          </w:p>
+        </w:tc>
+        <w:tc>
+          <w:tcPr>
+            <w:tcW w:type="dxa" w:w="1000"/>
+            <w:tcBorders>
+              <w:top w:val="single" w:color="D0D8E0" w:sz="4"/>
+              <w:left w:val="single" w:color="D0D8E0" w:sz="4"/>
+              <w:bottom w:val="single" w:color="D0D8E0" w:sz="4"/>
+              <w:right w:val="single" w:color="D0D8E0" w:sz="4"/>
+            </w:tcBorders>
+            <w:shd w:fill="E6F4EA" w:val="clear"/>
+            <w:tcMar>
+              <w:top w:type="dxa" w:w="80"/>
+              <w:left w:type="dxa" w:w="120"/>
+              <w:bottom w:type="dxa" w:w="80"/>
+              <w:right w:type="dxa" w:w="120"/>
+            </w:tcMar>
+          </w:tcPr>
+          <w:p>
+            <w:pPr>
+              <w:jc w:val="center"/>
+            </w:pPr>
+            <w:r>
+              <w:rPr>
+                <w:b/>
+                <w:bCs/>
+                <w:color w:val="1F6B3A"/>
+                <w:sz w:val="16"/>
+                <w:szCs w:val="16"/>
+                <w:rFonts w:ascii="Calibri" w:cs="Calibri" w:eastAsia="Calibri" w:hAnsi="Calibri"/>
+              </w:rPr>
+              <w:t xml:space="preserve">Done</w:t>
+            </w:r>
+          </w:p>
+        </w:tc>
+      </w:tr>
     </w:tbl>
     <w:p>
       <w:pPr>
@@ -12253,6 +12591,985 @@
         </w:tblBorders>
       </w:tblPr>
       <w:tblGrid>
+        <w:gridCol w:w="900"/>
+        <w:gridCol w:w="8460"/>
+      </w:tblGrid>
+      <w:tr>
+        <w:tc>
+          <w:tcPr>
+            <w:tcW w:type="dxa" w:w="900"/>
+            <w:tcBorders>
+              <w:top w:val="single" w:color="D0D8E0" w:sz="4"/>
+              <w:left w:val="single" w:color="D0D8E0" w:sz="4"/>
+              <w:bottom w:val="single" w:color="D0D8E0" w:sz="4"/>
+              <w:right w:val="single" w:color="D0D8E0" w:sz="4"/>
+            </w:tcBorders>
+            <w:shd w:fill="E6F4EA" w:val="clear"/>
+            <w:tcMar>
+              <w:top w:type="dxa" w:w="100"/>
+              <w:left w:type="dxa" w:w="80"/>
+              <w:bottom w:type="dxa" w:w="100"/>
+              <w:right w:type="dxa" w:w="80"/>
+            </w:tcMar>
+          </w:tcPr>
+          <w:p>
+            <w:pPr>
+              <w:jc w:val="center"/>
+            </w:pPr>
+            <w:r>
+              <w:rPr>
+                <w:b/>
+                <w:bCs/>
+                <w:color w:val="1F6B3A"/>
+                <w:sz w:val="22"/>
+                <w:szCs w:val="22"/>
+                <w:rFonts w:ascii="Segoe UI Symbol" w:cs="Segoe UI Symbol" w:eastAsia="Segoe UI Symbol" w:hAnsi="Segoe UI Symbol"/>
+              </w:rPr>
+              <w:t xml:space="preserve">☑</w:t>
+            </w:r>
+          </w:p>
+          <w:p>
+            <w:pPr>
+              <w:jc w:val="center"/>
+            </w:pPr>
+            <w:r>
+              <w:rPr>
+                <w:b/>
+                <w:bCs/>
+                <w:color w:val="1F6B3A"/>
+                <w:sz w:val="14"/>
+                <w:szCs w:val="14"/>
+                <w:rFonts w:ascii="Calibri" w:cs="Calibri" w:eastAsia="Calibri" w:hAnsi="Calibri"/>
+              </w:rPr>
+              <w:t xml:space="preserve">Done</w:t>
+            </w:r>
+          </w:p>
+        </w:tc>
+        <w:tc>
+          <w:tcPr>
+            <w:tcW w:type="dxa" w:w="8460"/>
+            <w:tcBorders>
+              <w:top w:val="single" w:color="D0D8E0" w:sz="4"/>
+              <w:left w:val="single" w:color="D0D8E0" w:sz="4"/>
+              <w:bottom w:val="single" w:color="D0D8E0" w:sz="4"/>
+              <w:right w:val="single" w:color="D0D8E0" w:sz="4"/>
+            </w:tcBorders>
+            <w:shd w:fill="F5F7FA" w:val="clear"/>
+            <w:tcMar>
+              <w:top w:type="dxa" w:w="100"/>
+              <w:left w:type="dxa" w:w="140"/>
+              <w:bottom w:type="dxa" w:w="100"/>
+              <w:right w:type="dxa" w:w="140"/>
+            </w:tcMar>
+          </w:tcPr>
+          <w:p>
+            <w:pPr>
+              <w:spacing w:after="40"/>
+            </w:pPr>
+            <w:r>
+              <w:rPr>
+                <w:b/>
+                <w:bCs/>
+                <w:color w:val="0F3A75"/>
+                <w:sz w:val="24"/>
+                <w:szCs w:val="24"/>
+                <w:rFonts w:ascii="Calibri" w:cs="Calibri" w:eastAsia="Calibri" w:hAnsi="Calibri"/>
+              </w:rPr>
+              <w:t xml:space="preserve">19. Remove approval control from Users</w:t>
+            </w:r>
+          </w:p>
+          <w:p>
+            <w:r>
+              <w:rPr>
+                <w:b/>
+                <w:bCs/>
+                <w:color w:val="5A6A7A"/>
+                <w:sz w:val="16"/>
+                <w:szCs w:val="16"/>
+                <w:rFonts w:ascii="Calibri" w:cs="Calibri" w:eastAsia="Calibri" w:hAnsi="Calibri"/>
+              </w:rPr>
+              <w:t xml:space="preserve">Category: </w:t>
+            </w:r>
+            <w:r>
+              <w:rPr>
+                <w:color w:val="5A6A7A"/>
+                <w:sz w:val="16"/>
+                <w:szCs w:val="16"/>
+                <w:rFonts w:ascii="Calibri" w:cs="Calibri" w:eastAsia="Calibri" w:hAnsi="Calibri"/>
+              </w:rPr>
+              <w:t xml:space="preserve">Users · Administration</w:t>
+            </w:r>
+          </w:p>
+        </w:tc>
+      </w:tr>
+    </w:tbl>
+    <w:p>
+      <w:pPr>
+        <w:spacing w:after="60"/>
+      </w:pPr>
+    </w:p>
+    <w:tbl>
+      <w:tblPr>
+        <w:tblW w:type="dxa" w:w="9360"/>
+        <w:tblBorders>
+          <w:top w:val="single" w:color="auto" w:sz="4"/>
+          <w:left w:val="single" w:color="auto" w:sz="4"/>
+          <w:bottom w:val="single" w:color="auto" w:sz="4"/>
+          <w:right w:val="single" w:color="auto" w:sz="4"/>
+          <w:insideH w:val="single" w:color="auto" w:sz="4"/>
+          <w:insideV w:val="single" w:color="auto" w:sz="4"/>
+        </w:tblBorders>
+      </w:tblPr>
+      <w:tblGrid>
+        <w:gridCol w:w="2200"/>
+        <w:gridCol w:w="7160"/>
+      </w:tblGrid>
+      <w:tr>
+        <w:tc>
+          <w:tcPr>
+            <w:tcW w:type="dxa" w:w="2200"/>
+            <w:tcBorders>
+              <w:top w:val="single" w:color="D0D8E0" w:sz="4"/>
+              <w:left w:val="single" w:color="D0D8E0" w:sz="4"/>
+              <w:bottom w:val="single" w:color="D0D8E0" w:sz="4"/>
+              <w:right w:val="single" w:color="D0D8E0" w:sz="4"/>
+            </w:tcBorders>
+            <w:shd w:fill="E8F1FB" w:val="clear"/>
+            <w:tcMar>
+              <w:top w:type="dxa" w:w="80"/>
+              <w:left w:type="dxa" w:w="120"/>
+              <w:bottom w:type="dxa" w:w="80"/>
+              <w:right w:type="dxa" w:w="120"/>
+            </w:tcMar>
+          </w:tcPr>
+          <w:p>
+            <w:pPr>
+              <w:jc w:val="left"/>
+            </w:pPr>
+            <w:r>
+              <w:rPr>
+                <w:b/>
+                <w:bCs/>
+                <w:color w:val="0F3A75"/>
+                <w:sz w:val="17"/>
+                <w:szCs w:val="17"/>
+                <w:rFonts w:ascii="Calibri" w:cs="Calibri" w:eastAsia="Calibri" w:hAnsi="Calibri"/>
+              </w:rPr>
+              <w:t xml:space="preserve">Where (menu)</w:t>
+            </w:r>
+          </w:p>
+        </w:tc>
+        <w:tc>
+          <w:tcPr>
+            <w:tcW w:type="dxa" w:w="7160"/>
+            <w:tcBorders>
+              <w:top w:val="single" w:color="D0D8E0" w:sz="4"/>
+              <w:left w:val="single" w:color="D0D8E0" w:sz="4"/>
+              <w:bottom w:val="single" w:color="D0D8E0" w:sz="4"/>
+              <w:right w:val="single" w:color="D0D8E0" w:sz="4"/>
+            </w:tcBorders>
+            <w:shd w:fill="FFFFFF" w:val="clear"/>
+            <w:tcMar>
+              <w:top w:type="dxa" w:w="80"/>
+              <w:left w:type="dxa" w:w="120"/>
+              <w:bottom w:type="dxa" w:w="80"/>
+              <w:right w:type="dxa" w:w="120"/>
+            </w:tcMar>
+          </w:tcPr>
+          <w:p>
+            <w:pPr>
+              <w:jc w:val="left"/>
+            </w:pPr>
+            <w:r>
+              <w:rPr>
+                <w:b w:val="false"/>
+                <w:bCs w:val="false"/>
+                <w:color w:val="0F2A44"/>
+                <w:sz w:val="17"/>
+                <w:szCs w:val="17"/>
+                <w:rFonts w:ascii="Calibri" w:cs="Calibri" w:eastAsia="Calibri" w:hAnsi="Calibri"/>
+              </w:rPr>
+              <w:t xml:space="preserve">Administration → Users → create / edit user</w:t>
+            </w:r>
+          </w:p>
+        </w:tc>
+      </w:tr>
+      <w:tr>
+        <w:tc>
+          <w:tcPr>
+            <w:tcW w:type="dxa" w:w="2200"/>
+            <w:tcBorders>
+              <w:top w:val="single" w:color="D0D8E0" w:sz="4"/>
+              <w:left w:val="single" w:color="D0D8E0" w:sz="4"/>
+              <w:bottom w:val="single" w:color="D0D8E0" w:sz="4"/>
+              <w:right w:val="single" w:color="D0D8E0" w:sz="4"/>
+            </w:tcBorders>
+            <w:shd w:fill="E8F1FB" w:val="clear"/>
+            <w:tcMar>
+              <w:top w:type="dxa" w:w="80"/>
+              <w:left w:type="dxa" w:w="120"/>
+              <w:bottom w:type="dxa" w:w="80"/>
+              <w:right w:type="dxa" w:w="120"/>
+            </w:tcMar>
+          </w:tcPr>
+          <w:p>
+            <w:pPr>
+              <w:jc w:val="left"/>
+            </w:pPr>
+            <w:r>
+              <w:rPr>
+                <w:b/>
+                <w:bCs/>
+                <w:color w:val="0F3A75"/>
+                <w:sz w:val="17"/>
+                <w:szCs w:val="17"/>
+                <w:rFonts w:ascii="Calibri" w:cs="Calibri" w:eastAsia="Calibri" w:hAnsi="Calibri"/>
+              </w:rPr>
+              <w:t xml:space="preserve">Page path</w:t>
+            </w:r>
+          </w:p>
+        </w:tc>
+        <w:tc>
+          <w:tcPr>
+            <w:tcW w:type="dxa" w:w="7160"/>
+            <w:tcBorders>
+              <w:top w:val="single" w:color="D0D8E0" w:sz="4"/>
+              <w:left w:val="single" w:color="D0D8E0" w:sz="4"/>
+              <w:bottom w:val="single" w:color="D0D8E0" w:sz="4"/>
+              <w:right w:val="single" w:color="D0D8E0" w:sz="4"/>
+            </w:tcBorders>
+            <w:shd w:fill="FFFFFF" w:val="clear"/>
+            <w:tcMar>
+              <w:top w:type="dxa" w:w="80"/>
+              <w:left w:type="dxa" w:w="120"/>
+              <w:bottom w:type="dxa" w:w="80"/>
+              <w:right w:type="dxa" w:w="120"/>
+            </w:tcMar>
+          </w:tcPr>
+          <w:p>
+            <w:pPr>
+              <w:jc w:val="left"/>
+            </w:pPr>
+            <w:r>
+              <w:rPr>
+                <w:b w:val="false"/>
+                <w:bCs w:val="false"/>
+                <w:color w:val="5A6A7A"/>
+                <w:sz w:val="17"/>
+                <w:szCs w:val="17"/>
+                <w:rFonts w:ascii="Calibri" w:cs="Calibri" w:eastAsia="Calibri" w:hAnsi="Calibri"/>
+              </w:rPr>
+              <w:t xml:space="preserve">/app/users · /app/users/new · /app/users/{id}/edit</w:t>
+            </w:r>
+          </w:p>
+        </w:tc>
+      </w:tr>
+      <w:tr>
+        <w:tc>
+          <w:tcPr>
+            <w:tcW w:type="dxa" w:w="2200"/>
+            <w:tcBorders>
+              <w:top w:val="single" w:color="D0D8E0" w:sz="4"/>
+              <w:left w:val="single" w:color="D0D8E0" w:sz="4"/>
+              <w:bottom w:val="single" w:color="D0D8E0" w:sz="4"/>
+              <w:right w:val="single" w:color="D0D8E0" w:sz="4"/>
+            </w:tcBorders>
+            <w:shd w:fill="E8F1FB" w:val="clear"/>
+            <w:tcMar>
+              <w:top w:type="dxa" w:w="80"/>
+              <w:left w:type="dxa" w:w="120"/>
+              <w:bottom w:type="dxa" w:w="80"/>
+              <w:right w:type="dxa" w:w="120"/>
+            </w:tcMar>
+          </w:tcPr>
+          <w:p>
+            <w:pPr>
+              <w:jc w:val="left"/>
+            </w:pPr>
+            <w:r>
+              <w:rPr>
+                <w:b/>
+                <w:bCs/>
+                <w:color w:val="0F3A75"/>
+                <w:sz w:val="17"/>
+                <w:szCs w:val="17"/>
+                <w:rFonts w:ascii="Calibri" w:cs="Calibri" w:eastAsia="Calibri" w:hAnsi="Calibri"/>
+              </w:rPr>
+              <w:t xml:space="preserve">What was added / changed</w:t>
+            </w:r>
+          </w:p>
+        </w:tc>
+        <w:tc>
+          <w:tcPr>
+            <w:tcW w:type="dxa" w:w="7160"/>
+            <w:tcBorders>
+              <w:top w:val="single" w:color="D0D8E0" w:sz="4"/>
+              <w:left w:val="single" w:color="D0D8E0" w:sz="4"/>
+              <w:bottom w:val="single" w:color="D0D8E0" w:sz="4"/>
+              <w:right w:val="single" w:color="D0D8E0" w:sz="4"/>
+            </w:tcBorders>
+            <w:shd w:fill="FFFFFF" w:val="clear"/>
+            <w:tcMar>
+              <w:top w:type="dxa" w:w="80"/>
+              <w:left w:type="dxa" w:w="120"/>
+              <w:bottom w:type="dxa" w:w="80"/>
+              <w:right w:type="dxa" w:w="120"/>
+            </w:tcMar>
+          </w:tcPr>
+          <w:p>
+            <w:pPr>
+              <w:jc w:val="left"/>
+            </w:pPr>
+            <w:r>
+              <w:rPr>
+                <w:b w:val="false"/>
+                <w:bCs w:val="false"/>
+                <w:color w:val="0F2A44"/>
+                <w:sz w:val="17"/>
+                <w:szCs w:val="17"/>
+                <w:rFonts w:ascii="Calibri" w:cs="Calibri" w:eastAsia="Calibri" w:hAnsi="Calibri"/>
+              </w:rPr>
+              <w:t xml:space="preserve">The “Bypass approval steps” switch is removed from the user create and edit form. Staff no longer set a per-user approval bypass on the Users screen. Approval behaviour is controlled by organization Settings (Skip approvals), not by a user-level toggle.</w:t>
+            </w:r>
+          </w:p>
+        </w:tc>
+      </w:tr>
+    </w:tbl>
+    <w:p>
+      <w:pPr>
+        <w:spacing w:after="40" w:before="120"/>
+        <w:jc w:val="left"/>
+      </w:pPr>
+      <w:r>
+        <w:rPr>
+          <w:b/>
+          <w:bCs/>
+          <w:i w:val="false"/>
+          <w:iCs w:val="false"/>
+          <w:color w:val="0F3A75"/>
+          <w:sz w:val="20"/>
+          <w:szCs w:val="20"/>
+          <w:rFonts w:ascii="Calibri" w:cs="Calibri" w:eastAsia="Calibri" w:hAnsi="Calibri"/>
+        </w:rPr>
+        <w:t xml:space="preserve">How to use</w:t>
+      </w:r>
+    </w:p>
+    <w:p>
+      <w:pPr>
+        <w:spacing w:after="80"/>
+      </w:pPr>
+      <w:r>
+        <w:rPr>
+          <w:b/>
+          <w:bCs/>
+          <w:i w:val="false"/>
+          <w:iCs w:val="false"/>
+          <w:color w:val="1B4F9C"/>
+          <w:sz w:val="18"/>
+          <w:szCs w:val="18"/>
+          <w:rFonts w:ascii="Calibri" w:cs="Calibri" w:eastAsia="Calibri" w:hAnsi="Calibri"/>
+        </w:rPr>
+        <w:t xml:space="preserve">1. </w:t>
+      </w:r>
+      <w:r>
+        <w:rPr>
+          <w:b w:val="false"/>
+          <w:bCs w:val="false"/>
+          <w:i w:val="false"/>
+          <w:iCs w:val="false"/>
+          <w:color w:val="0F2A44"/>
+          <w:sz w:val="18"/>
+          <w:szCs w:val="18"/>
+          <w:rFonts w:ascii="Calibri" w:cs="Calibri" w:eastAsia="Calibri" w:hAnsi="Calibri"/>
+        </w:rPr>
+        <w:t xml:space="preserve">Open Users → create or edit a staff user.</w:t>
+      </w:r>
+    </w:p>
+    <w:p>
+      <w:pPr>
+        <w:spacing w:after="80"/>
+      </w:pPr>
+      <w:r>
+        <w:rPr>
+          <w:b/>
+          <w:bCs/>
+          <w:i w:val="false"/>
+          <w:iCs w:val="false"/>
+          <w:color w:val="1B4F9C"/>
+          <w:sz w:val="18"/>
+          <w:szCs w:val="18"/>
+          <w:rFonts w:ascii="Calibri" w:cs="Calibri" w:eastAsia="Calibri" w:hAnsi="Calibri"/>
+        </w:rPr>
+        <w:t xml:space="preserve">2. </w:t>
+      </w:r>
+      <w:r>
+        <w:rPr>
+          <w:b w:val="false"/>
+          <w:bCs w:val="false"/>
+          <w:i w:val="false"/>
+          <w:iCs w:val="false"/>
+          <w:color w:val="0F2A44"/>
+          <w:sz w:val="18"/>
+          <w:szCs w:val="18"/>
+          <w:rFonts w:ascii="Calibri" w:cs="Calibri" w:eastAsia="Calibri" w:hAnsi="Calibri"/>
+        </w:rPr>
+        <w:t xml:space="preserve">Confirm there is no “Bypass approval steps” switch on the form.</w:t>
+      </w:r>
+    </w:p>
+    <w:p>
+      <w:pPr>
+        <w:spacing w:after="80"/>
+      </w:pPr>
+      <w:r>
+        <w:rPr>
+          <w:b/>
+          <w:bCs/>
+          <w:i w:val="false"/>
+          <w:iCs w:val="false"/>
+          <w:color w:val="1B4F9C"/>
+          <w:sz w:val="18"/>
+          <w:szCs w:val="18"/>
+          <w:rFonts w:ascii="Calibri" w:cs="Calibri" w:eastAsia="Calibri" w:hAnsi="Calibri"/>
+        </w:rPr>
+        <w:t xml:space="preserve">3. </w:t>
+      </w:r>
+      <w:r>
+        <w:rPr>
+          <w:b w:val="false"/>
+          <w:bCs w:val="false"/>
+          <w:i w:val="false"/>
+          <w:iCs w:val="false"/>
+          <w:color w:val="0F2A44"/>
+          <w:sz w:val="18"/>
+          <w:szCs w:val="18"/>
+          <w:rFonts w:ascii="Calibri" w:cs="Calibri" w:eastAsia="Calibri" w:hAnsi="Calibri"/>
+        </w:rPr>
+        <w:t xml:space="preserve">Set roles and module access as usual, then save.</w:t>
+      </w:r>
+    </w:p>
+    <w:p>
+      <w:pPr>
+        <w:spacing w:after="80"/>
+      </w:pPr>
+      <w:r>
+        <w:rPr>
+          <w:b/>
+          <w:bCs/>
+          <w:i w:val="false"/>
+          <w:iCs w:val="false"/>
+          <w:color w:val="1B4F9C"/>
+          <w:sz w:val="18"/>
+          <w:szCs w:val="18"/>
+          <w:rFonts w:ascii="Calibri" w:cs="Calibri" w:eastAsia="Calibri" w:hAnsi="Calibri"/>
+        </w:rPr>
+        <w:t xml:space="preserve">4. </w:t>
+      </w:r>
+      <w:r>
+        <w:rPr>
+          <w:b w:val="false"/>
+          <w:bCs w:val="false"/>
+          <w:i w:val="false"/>
+          <w:iCs w:val="false"/>
+          <w:color w:val="0F2A44"/>
+          <w:sz w:val="18"/>
+          <w:szCs w:val="18"/>
+          <w:rFonts w:ascii="Calibri" w:cs="Calibri" w:eastAsia="Calibri" w:hAnsi="Calibri"/>
+        </w:rPr>
+        <w:t xml:space="preserve">Use Admin → Settings → Skip approvals if the organization should run without approval queues.</w:t>
+      </w:r>
+    </w:p>
+    <w:p>
+      <w:pPr>
+        <w:spacing w:after="280"/>
+      </w:pPr>
+    </w:p>
+    <w:tbl>
+      <w:tblPr>
+        <w:tblW w:type="dxa" w:w="9360"/>
+        <w:tblBorders>
+          <w:top w:val="single" w:color="auto" w:sz="4"/>
+          <w:left w:val="single" w:color="auto" w:sz="4"/>
+          <w:bottom w:val="single" w:color="auto" w:sz="4"/>
+          <w:right w:val="single" w:color="auto" w:sz="4"/>
+          <w:insideH w:val="single" w:color="auto" w:sz="4"/>
+          <w:insideV w:val="single" w:color="auto" w:sz="4"/>
+        </w:tblBorders>
+      </w:tblPr>
+      <w:tblGrid>
+        <w:gridCol w:w="900"/>
+        <w:gridCol w:w="8460"/>
+      </w:tblGrid>
+      <w:tr>
+        <w:tc>
+          <w:tcPr>
+            <w:tcW w:type="dxa" w:w="900"/>
+            <w:tcBorders>
+              <w:top w:val="single" w:color="D0D8E0" w:sz="4"/>
+              <w:left w:val="single" w:color="D0D8E0" w:sz="4"/>
+              <w:bottom w:val="single" w:color="D0D8E0" w:sz="4"/>
+              <w:right w:val="single" w:color="D0D8E0" w:sz="4"/>
+            </w:tcBorders>
+            <w:shd w:fill="E6F4EA" w:val="clear"/>
+            <w:tcMar>
+              <w:top w:type="dxa" w:w="100"/>
+              <w:left w:type="dxa" w:w="80"/>
+              <w:bottom w:type="dxa" w:w="100"/>
+              <w:right w:type="dxa" w:w="80"/>
+            </w:tcMar>
+          </w:tcPr>
+          <w:p>
+            <w:pPr>
+              <w:jc w:val="center"/>
+            </w:pPr>
+            <w:r>
+              <w:rPr>
+                <w:b/>
+                <w:bCs/>
+                <w:color w:val="1F6B3A"/>
+                <w:sz w:val="22"/>
+                <w:szCs w:val="22"/>
+                <w:rFonts w:ascii="Segoe UI Symbol" w:cs="Segoe UI Symbol" w:eastAsia="Segoe UI Symbol" w:hAnsi="Segoe UI Symbol"/>
+              </w:rPr>
+              <w:t xml:space="preserve">☑</w:t>
+            </w:r>
+          </w:p>
+          <w:p>
+            <w:pPr>
+              <w:jc w:val="center"/>
+            </w:pPr>
+            <w:r>
+              <w:rPr>
+                <w:b/>
+                <w:bCs/>
+                <w:color w:val="1F6B3A"/>
+                <w:sz w:val="14"/>
+                <w:szCs w:val="14"/>
+                <w:rFonts w:ascii="Calibri" w:cs="Calibri" w:eastAsia="Calibri" w:hAnsi="Calibri"/>
+              </w:rPr>
+              <w:t xml:space="preserve">Done</w:t>
+            </w:r>
+          </w:p>
+        </w:tc>
+        <w:tc>
+          <w:tcPr>
+            <w:tcW w:type="dxa" w:w="8460"/>
+            <w:tcBorders>
+              <w:top w:val="single" w:color="D0D8E0" w:sz="4"/>
+              <w:left w:val="single" w:color="D0D8E0" w:sz="4"/>
+              <w:bottom w:val="single" w:color="D0D8E0" w:sz="4"/>
+              <w:right w:val="single" w:color="D0D8E0" w:sz="4"/>
+            </w:tcBorders>
+            <w:shd w:fill="F5F7FA" w:val="clear"/>
+            <w:tcMar>
+              <w:top w:type="dxa" w:w="100"/>
+              <w:left w:type="dxa" w:w="140"/>
+              <w:bottom w:type="dxa" w:w="100"/>
+              <w:right w:type="dxa" w:w="140"/>
+            </w:tcMar>
+          </w:tcPr>
+          <w:p>
+            <w:pPr>
+              <w:spacing w:after="40"/>
+            </w:pPr>
+            <w:r>
+              <w:rPr>
+                <w:b/>
+                <w:bCs/>
+                <w:color w:val="0F3A75"/>
+                <w:sz w:val="24"/>
+                <w:szCs w:val="24"/>
+                <w:rFonts w:ascii="Calibri" w:cs="Calibri" w:eastAsia="Calibri" w:hAnsi="Calibri"/>
+              </w:rPr>
+              <w:t xml:space="preserve">20. Final service report — remove Service section</w:t>
+            </w:r>
+          </w:p>
+          <w:p>
+            <w:r>
+              <w:rPr>
+                <w:b/>
+                <w:bCs/>
+                <w:color w:val="5A6A7A"/>
+                <w:sz w:val="16"/>
+                <w:szCs w:val="16"/>
+                <w:rFonts w:ascii="Calibri" w:cs="Calibri" w:eastAsia="Calibri" w:hAnsi="Calibri"/>
+              </w:rPr>
+              <w:t xml:space="preserve">Category: </w:t>
+            </w:r>
+            <w:r>
+              <w:rPr>
+                <w:color w:val="5A6A7A"/>
+                <w:sz w:val="16"/>
+                <w:szCs w:val="16"/>
+                <w:rFonts w:ascii="Calibri" w:cs="Calibri" w:eastAsia="Calibri" w:hAnsi="Calibri"/>
+              </w:rPr>
+              <w:t xml:space="preserve">Reports / PDFs</w:t>
+            </w:r>
+          </w:p>
+        </w:tc>
+      </w:tr>
+    </w:tbl>
+    <w:p>
+      <w:pPr>
+        <w:spacing w:after="60"/>
+      </w:pPr>
+    </w:p>
+    <w:tbl>
+      <w:tblPr>
+        <w:tblW w:type="dxa" w:w="9360"/>
+        <w:tblBorders>
+          <w:top w:val="single" w:color="auto" w:sz="4"/>
+          <w:left w:val="single" w:color="auto" w:sz="4"/>
+          <w:bottom w:val="single" w:color="auto" w:sz="4"/>
+          <w:right w:val="single" w:color="auto" w:sz="4"/>
+          <w:insideH w:val="single" w:color="auto" w:sz="4"/>
+          <w:insideV w:val="single" w:color="auto" w:sz="4"/>
+        </w:tblBorders>
+      </w:tblPr>
+      <w:tblGrid>
+        <w:gridCol w:w="2200"/>
+        <w:gridCol w:w="7160"/>
+      </w:tblGrid>
+      <w:tr>
+        <w:tc>
+          <w:tcPr>
+            <w:tcW w:type="dxa" w:w="2200"/>
+            <w:tcBorders>
+              <w:top w:val="single" w:color="D0D8E0" w:sz="4"/>
+              <w:left w:val="single" w:color="D0D8E0" w:sz="4"/>
+              <w:bottom w:val="single" w:color="D0D8E0" w:sz="4"/>
+              <w:right w:val="single" w:color="D0D8E0" w:sz="4"/>
+            </w:tcBorders>
+            <w:shd w:fill="E8F1FB" w:val="clear"/>
+            <w:tcMar>
+              <w:top w:type="dxa" w:w="80"/>
+              <w:left w:type="dxa" w:w="120"/>
+              <w:bottom w:type="dxa" w:w="80"/>
+              <w:right w:type="dxa" w:w="120"/>
+            </w:tcMar>
+          </w:tcPr>
+          <w:p>
+            <w:pPr>
+              <w:jc w:val="left"/>
+            </w:pPr>
+            <w:r>
+              <w:rPr>
+                <w:b/>
+                <w:bCs/>
+                <w:color w:val="0F3A75"/>
+                <w:sz w:val="17"/>
+                <w:szCs w:val="17"/>
+                <w:rFonts w:ascii="Calibri" w:cs="Calibri" w:eastAsia="Calibri" w:hAnsi="Calibri"/>
+              </w:rPr>
+              <w:t xml:space="preserve">Where (menu)</w:t>
+            </w:r>
+          </w:p>
+        </w:tc>
+        <w:tc>
+          <w:tcPr>
+            <w:tcW w:type="dxa" w:w="7160"/>
+            <w:tcBorders>
+              <w:top w:val="single" w:color="D0D8E0" w:sz="4"/>
+              <w:left w:val="single" w:color="D0D8E0" w:sz="4"/>
+              <w:bottom w:val="single" w:color="D0D8E0" w:sz="4"/>
+              <w:right w:val="single" w:color="D0D8E0" w:sz="4"/>
+            </w:tcBorders>
+            <w:shd w:fill="FFFFFF" w:val="clear"/>
+            <w:tcMar>
+              <w:top w:type="dxa" w:w="80"/>
+              <w:left w:type="dxa" w:w="120"/>
+              <w:bottom w:type="dxa" w:w="80"/>
+              <w:right w:type="dxa" w:w="120"/>
+            </w:tcMar>
+          </w:tcPr>
+          <w:p>
+            <w:pPr>
+              <w:jc w:val="left"/>
+            </w:pPr>
+            <w:r>
+              <w:rPr>
+                <w:b w:val="false"/>
+                <w:bCs w:val="false"/>
+                <w:color w:val="0F2A44"/>
+                <w:sz w:val="17"/>
+                <w:szCs w:val="17"/>
+                <w:rFonts w:ascii="Calibri" w:cs="Calibri" w:eastAsia="Calibri" w:hAnsi="Calibri"/>
+              </w:rPr>
+              <w:t xml:space="preserve">Jobs → Download Service Report (Final Service Report PDF)</w:t>
+            </w:r>
+          </w:p>
+        </w:tc>
+      </w:tr>
+      <w:tr>
+        <w:tc>
+          <w:tcPr>
+            <w:tcW w:type="dxa" w:w="2200"/>
+            <w:tcBorders>
+              <w:top w:val="single" w:color="D0D8E0" w:sz="4"/>
+              <w:left w:val="single" w:color="D0D8E0" w:sz="4"/>
+              <w:bottom w:val="single" w:color="D0D8E0" w:sz="4"/>
+              <w:right w:val="single" w:color="D0D8E0" w:sz="4"/>
+            </w:tcBorders>
+            <w:shd w:fill="E8F1FB" w:val="clear"/>
+            <w:tcMar>
+              <w:top w:type="dxa" w:w="80"/>
+              <w:left w:type="dxa" w:w="120"/>
+              <w:bottom w:type="dxa" w:w="80"/>
+              <w:right w:type="dxa" w:w="120"/>
+            </w:tcMar>
+          </w:tcPr>
+          <w:p>
+            <w:pPr>
+              <w:jc w:val="left"/>
+            </w:pPr>
+            <w:r>
+              <w:rPr>
+                <w:b/>
+                <w:bCs/>
+                <w:color w:val="0F3A75"/>
+                <w:sz w:val="17"/>
+                <w:szCs w:val="17"/>
+                <w:rFonts w:ascii="Calibri" w:cs="Calibri" w:eastAsia="Calibri" w:hAnsi="Calibri"/>
+              </w:rPr>
+              <w:t xml:space="preserve">Page path</w:t>
+            </w:r>
+          </w:p>
+        </w:tc>
+        <w:tc>
+          <w:tcPr>
+            <w:tcW w:type="dxa" w:w="7160"/>
+            <w:tcBorders>
+              <w:top w:val="single" w:color="D0D8E0" w:sz="4"/>
+              <w:left w:val="single" w:color="D0D8E0" w:sz="4"/>
+              <w:bottom w:val="single" w:color="D0D8E0" w:sz="4"/>
+              <w:right w:val="single" w:color="D0D8E0" w:sz="4"/>
+            </w:tcBorders>
+            <w:shd w:fill="FFFFFF" w:val="clear"/>
+            <w:tcMar>
+              <w:top w:type="dxa" w:w="80"/>
+              <w:left w:type="dxa" w:w="120"/>
+              <w:bottom w:type="dxa" w:w="80"/>
+              <w:right w:type="dxa" w:w="120"/>
+            </w:tcMar>
+          </w:tcPr>
+          <w:p>
+            <w:pPr>
+              <w:jc w:val="left"/>
+            </w:pPr>
+            <w:r>
+              <w:rPr>
+                <w:b w:val="false"/>
+                <w:bCs w:val="false"/>
+                <w:color w:val="5A6A7A"/>
+                <w:sz w:val="17"/>
+                <w:szCs w:val="17"/>
+                <w:rFonts w:ascii="Calibri" w:cs="Calibri" w:eastAsia="Calibri" w:hAnsi="Calibri"/>
+              </w:rPr>
+              <w:t xml:space="preserve">/app/jobs/{id} · mobile job detail (Download Service Report)</w:t>
+            </w:r>
+          </w:p>
+        </w:tc>
+      </w:tr>
+      <w:tr>
+        <w:tc>
+          <w:tcPr>
+            <w:tcW w:type="dxa" w:w="2200"/>
+            <w:tcBorders>
+              <w:top w:val="single" w:color="D0D8E0" w:sz="4"/>
+              <w:left w:val="single" w:color="D0D8E0" w:sz="4"/>
+              <w:bottom w:val="single" w:color="D0D8E0" w:sz="4"/>
+              <w:right w:val="single" w:color="D0D8E0" w:sz="4"/>
+            </w:tcBorders>
+            <w:shd w:fill="E8F1FB" w:val="clear"/>
+            <w:tcMar>
+              <w:top w:type="dxa" w:w="80"/>
+              <w:left w:type="dxa" w:w="120"/>
+              <w:bottom w:type="dxa" w:w="80"/>
+              <w:right w:type="dxa" w:w="120"/>
+            </w:tcMar>
+          </w:tcPr>
+          <w:p>
+            <w:pPr>
+              <w:jc w:val="left"/>
+            </w:pPr>
+            <w:r>
+              <w:rPr>
+                <w:b/>
+                <w:bCs/>
+                <w:color w:val="0F3A75"/>
+                <w:sz w:val="17"/>
+                <w:szCs w:val="17"/>
+                <w:rFonts w:ascii="Calibri" w:cs="Calibri" w:eastAsia="Calibri" w:hAnsi="Calibri"/>
+              </w:rPr>
+              <w:t xml:space="preserve">What was added / changed</w:t>
+            </w:r>
+          </w:p>
+        </w:tc>
+        <w:tc>
+          <w:tcPr>
+            <w:tcW w:type="dxa" w:w="7160"/>
+            <w:tcBorders>
+              <w:top w:val="single" w:color="D0D8E0" w:sz="4"/>
+              <w:left w:val="single" w:color="D0D8E0" w:sz="4"/>
+              <w:bottom w:val="single" w:color="D0D8E0" w:sz="4"/>
+              <w:right w:val="single" w:color="D0D8E0" w:sz="4"/>
+            </w:tcBorders>
+            <w:shd w:fill="FFFFFF" w:val="clear"/>
+            <w:tcMar>
+              <w:top w:type="dxa" w:w="80"/>
+              <w:left w:type="dxa" w:w="120"/>
+              <w:bottom w:type="dxa" w:w="80"/>
+              <w:right w:type="dxa" w:w="120"/>
+            </w:tcMar>
+          </w:tcPr>
+          <w:p>
+            <w:pPr>
+              <w:jc w:val="left"/>
+            </w:pPr>
+            <w:r>
+              <w:rPr>
+                <w:b w:val="false"/>
+                <w:bCs w:val="false"/>
+                <w:color w:val="0F2A44"/>
+                <w:sz w:val="17"/>
+                <w:szCs w:val="17"/>
+                <w:rFonts w:ascii="Calibri" w:cs="Calibri" w:eastAsia="Calibri" w:hAnsi="Calibri"/>
+              </w:rPr>
+              <w:t xml:space="preserve">The Final Service Report PDF no longer includes the redundant Service section. Removed fields: Service Type, Ticket Number, Scheduled Date, Service Date, Completed Date, and Ticket Opened Date. Report number, service date, completed date, and ticket remain in the PDF header only.</w:t>
+            </w:r>
+          </w:p>
+        </w:tc>
+      </w:tr>
+    </w:tbl>
+    <w:p>
+      <w:pPr>
+        <w:spacing w:after="40" w:before="120"/>
+        <w:jc w:val="left"/>
+      </w:pPr>
+      <w:r>
+        <w:rPr>
+          <w:b/>
+          <w:bCs/>
+          <w:i w:val="false"/>
+          <w:iCs w:val="false"/>
+          <w:color w:val="0F3A75"/>
+          <w:sz w:val="20"/>
+          <w:szCs w:val="20"/>
+          <w:rFonts w:ascii="Calibri" w:cs="Calibri" w:eastAsia="Calibri" w:hAnsi="Calibri"/>
+        </w:rPr>
+        <w:t xml:space="preserve">How to use</w:t>
+      </w:r>
+    </w:p>
+    <w:p>
+      <w:pPr>
+        <w:spacing w:after="80"/>
+      </w:pPr>
+      <w:r>
+        <w:rPr>
+          <w:b/>
+          <w:bCs/>
+          <w:i w:val="false"/>
+          <w:iCs w:val="false"/>
+          <w:color w:val="1B4F9C"/>
+          <w:sz w:val="18"/>
+          <w:szCs w:val="18"/>
+          <w:rFonts w:ascii="Calibri" w:cs="Calibri" w:eastAsia="Calibri" w:hAnsi="Calibri"/>
+        </w:rPr>
+        <w:t xml:space="preserve">1. </w:t>
+      </w:r>
+      <w:r>
+        <w:rPr>
+          <w:b w:val="false"/>
+          <w:bCs w:val="false"/>
+          <w:i w:val="false"/>
+          <w:iCs w:val="false"/>
+          <w:color w:val="0F2A44"/>
+          <w:sz w:val="18"/>
+          <w:szCs w:val="18"/>
+          <w:rFonts w:ascii="Calibri" w:cs="Calibri" w:eastAsia="Calibri" w:hAnsi="Calibri"/>
+        </w:rPr>
+        <w:t xml:space="preserve">Open a completed job and use Download Service Report (or regenerate the report).</w:t>
+      </w:r>
+    </w:p>
+    <w:p>
+      <w:pPr>
+        <w:spacing w:after="80"/>
+      </w:pPr>
+      <w:r>
+        <w:rPr>
+          <w:b/>
+          <w:bCs/>
+          <w:i w:val="false"/>
+          <w:iCs w:val="false"/>
+          <w:color w:val="1B4F9C"/>
+          <w:sz w:val="18"/>
+          <w:szCs w:val="18"/>
+          <w:rFonts w:ascii="Calibri" w:cs="Calibri" w:eastAsia="Calibri" w:hAnsi="Calibri"/>
+        </w:rPr>
+        <w:t xml:space="preserve">2. </w:t>
+      </w:r>
+      <w:r>
+        <w:rPr>
+          <w:b w:val="false"/>
+          <w:bCs w:val="false"/>
+          <w:i w:val="false"/>
+          <w:iCs w:val="false"/>
+          <w:color w:val="0F2A44"/>
+          <w:sz w:val="18"/>
+          <w:szCs w:val="18"/>
+          <w:rFonts w:ascii="Calibri" w:cs="Calibri" w:eastAsia="Calibri" w:hAnsi="Calibri"/>
+        </w:rPr>
+        <w:t xml:space="preserve">Confirm there is no Service section listing Service Type, Ticket, Scheduled, Service date, Completed, or Ticket opened.</w:t>
+      </w:r>
+    </w:p>
+    <w:p>
+      <w:pPr>
+        <w:spacing w:after="80"/>
+      </w:pPr>
+      <w:r>
+        <w:rPr>
+          <w:b/>
+          <w:bCs/>
+          <w:i w:val="false"/>
+          <w:iCs w:val="false"/>
+          <w:color w:val="1B4F9C"/>
+          <w:sz w:val="18"/>
+          <w:szCs w:val="18"/>
+          <w:rFonts w:ascii="Calibri" w:cs="Calibri" w:eastAsia="Calibri" w:hAnsi="Calibri"/>
+        </w:rPr>
+        <w:t xml:space="preserve">3. </w:t>
+      </w:r>
+      <w:r>
+        <w:rPr>
+          <w:b w:val="false"/>
+          <w:bCs w:val="false"/>
+          <w:i w:val="false"/>
+          <w:iCs w:val="false"/>
+          <w:color w:val="0F2A44"/>
+          <w:sz w:val="18"/>
+          <w:szCs w:val="18"/>
+          <w:rFonts w:ascii="Calibri" w:cs="Calibri" w:eastAsia="Calibri" w:hAnsi="Calibri"/>
+        </w:rPr>
+        <w:t xml:space="preserve">Confirm those key facts still appear once in the report header where needed.</w:t>
+      </w:r>
+    </w:p>
+    <w:p>
+      <w:pPr>
+        <w:spacing w:after="280"/>
+      </w:pPr>
+    </w:p>
+    <w:tbl>
+      <w:tblPr>
+        <w:tblW w:type="dxa" w:w="9360"/>
+        <w:tblBorders>
+          <w:top w:val="single" w:color="auto" w:sz="4"/>
+          <w:left w:val="single" w:color="auto" w:sz="4"/>
+          <w:bottom w:val="single" w:color="auto" w:sz="4"/>
+          <w:right w:val="single" w:color="auto" w:sz="4"/>
+          <w:insideH w:val="single" w:color="auto" w:sz="4"/>
+          <w:insideV w:val="single" w:color="auto" w:sz="4"/>
+        </w:tblBorders>
+      </w:tblPr>
+      <w:tblGrid>
         <w:gridCol w:w="9360"/>
       </w:tblGrid>
       <w:tr>
@@ -12865,7 +14182,7 @@
                 <w:szCs w:val="17"/>
                 <w:rFonts w:ascii="Calibri" w:cs="Calibri" w:eastAsia="Calibri" w:hAnsi="Calibri"/>
               </w:rPr>
-              <w:t xml:space="preserve">1 Default tax (Settings) · 12 QA checklist defaults · 14 Service report PDF</w:t>
+              <w:t xml:space="preserve">1 Default tax (Settings) · 12 QA checklist defaults · 14 Service report PDF · 20 Final service report Service section removed</w:t>
             </w:r>
           </w:p>
         </w:tc>
@@ -12936,6 +14253,76 @@
                 <w:rFonts w:ascii="Calibri" w:cs="Calibri" w:eastAsia="Calibri" w:hAnsi="Calibri"/>
               </w:rPr>
               <w:t xml:space="preserve">14 Inspection report PDF · 18 Signature draw / upload</w:t>
+            </w:r>
+          </w:p>
+        </w:tc>
+      </w:tr>
+      <w:tr>
+        <w:tc>
+          <w:tcPr>
+            <w:tcW w:type="dxa" w:w="2800"/>
+            <w:tcBorders>
+              <w:top w:val="single" w:color="D0D8E0" w:sz="4"/>
+              <w:left w:val="single" w:color="D0D8E0" w:sz="4"/>
+              <w:bottom w:val="single" w:color="D0D8E0" w:sz="4"/>
+              <w:right w:val="single" w:color="D0D8E0" w:sz="4"/>
+            </w:tcBorders>
+            <w:shd w:fill="E8F1FB" w:val="clear"/>
+            <w:tcMar>
+              <w:top w:type="dxa" w:w="80"/>
+              <w:left w:type="dxa" w:w="120"/>
+              <w:bottom w:type="dxa" w:w="80"/>
+              <w:right w:type="dxa" w:w="120"/>
+            </w:tcMar>
+          </w:tcPr>
+          <w:p>
+            <w:pPr>
+              <w:jc w:val="left"/>
+            </w:pPr>
+            <w:r>
+              <w:rPr>
+                <w:b/>
+                <w:bCs/>
+                <w:color w:val="0F2A44"/>
+                <w:sz w:val="17"/>
+                <w:szCs w:val="17"/>
+                <w:rFonts w:ascii="Calibri" w:cs="Calibri" w:eastAsia="Calibri" w:hAnsi="Calibri"/>
+              </w:rPr>
+              <w:t xml:space="preserve">Users / Settings</w:t>
+            </w:r>
+          </w:p>
+        </w:tc>
+        <w:tc>
+          <w:tcPr>
+            <w:tcW w:type="dxa" w:w="6560"/>
+            <w:tcBorders>
+              <w:top w:val="single" w:color="D0D8E0" w:sz="4"/>
+              <w:left w:val="single" w:color="D0D8E0" w:sz="4"/>
+              <w:bottom w:val="single" w:color="D0D8E0" w:sz="4"/>
+              <w:right w:val="single" w:color="D0D8E0" w:sz="4"/>
+            </w:tcBorders>
+            <w:shd w:fill="FFFFFF" w:val="clear"/>
+            <w:tcMar>
+              <w:top w:type="dxa" w:w="80"/>
+              <w:left w:type="dxa" w:w="120"/>
+              <w:bottom w:type="dxa" w:w="80"/>
+              <w:right w:type="dxa" w:w="120"/>
+            </w:tcMar>
+          </w:tcPr>
+          <w:p>
+            <w:pPr>
+              <w:jc w:val="left"/>
+            </w:pPr>
+            <w:r>
+              <w:rPr>
+                <w:b w:val="false"/>
+                <w:bCs w:val="false"/>
+                <w:color w:val="0F2A44"/>
+                <w:sz w:val="17"/>
+                <w:szCs w:val="17"/>
+                <w:rFonts w:ascii="Calibri" w:cs="Calibri" w:eastAsia="Calibri" w:hAnsi="Calibri"/>
+              </w:rPr>
+              <w:t xml:space="preserve">19 Remove approval control from Users · Skip approvals remains in Settings</w:t>
             </w:r>
           </w:p>
         </w:tc>
@@ -13016,7 +14403,7 @@
           <w:szCs w:val="19"/>
           <w:rFonts w:ascii="Calibri" w:cs="Calibri" w:eastAsia="Calibri" w:hAnsi="Calibri"/>
         </w:rPr>
-        <w:t xml:space="preserve">All eighteen corrections listed in this document are implemented on the live site. Staff should use the Where (menu) and How to use steps when training or verifying each change. If a later review finds any purchase-order step still missing or out of order, that can be listed in a short follow-up note under item 10.</w:t>
+        <w:t xml:space="preserve">All twenty corrections listed in this document are implemented on the live site. Staff should use the Where (menu) and How to use steps when training or verifying each change. If a later review finds any purchase-order step still missing or out of order, that can be listed in a short follow-up note under item 10.</w:t>
       </w:r>
     </w:p>
     <w:p>
@@ -13097,7 +14484,7 @@
         <w:szCs w:val="16"/>
         <w:rFonts w:ascii="Calibri" w:cs="Calibri" w:eastAsia="Calibri" w:hAnsi="Calibri"/>
       </w:rPr>
-      <w:t xml:space="preserve">27 October 2026</w:t>
+      <w:t xml:space="preserve">30 October 2026</w:t>
     </w:r>
   </w:p>
 </w:ftr>

</xml_diff>